<commit_message>
Grade 11 Biology PDFs + teacher index; full re-render of attribution block
- Grade 11 Biology: 186 PDFs (30 lesson docs, 78 Quick Checks, 78 Answer Keys) under v2/PDF/Grade11, 78 answer-key html
- Teacher index now 95 sub-strands / 285 documents across Grades 10 and 11
- Grade 10 + other subjects: re-rendered docx/PDFs with attribution block moved (text content unchanged, no *_data.json changes)
- STATUS.md: Grade 11 Biology row + session log

Co-Authored-By: Claude Sonnet 5.5 <noreply@anthropic.com>
</commit_message>
<xml_diff>
--- a/data/outputs/v2/Biology/SS1.2_Chemicals_of_Life/Biology_Chemicals_of_Life_SummaryTable.docx
+++ b/data/outputs/v2/Biology/SS1.2_Chemicals_of_Life/Biology_Chemicals_of_Life_SummaryTable.docx
@@ -38,177 +38,6 @@
           <w:szCs w:val="22"/>
         </w:rPr>
         <w:t xml:space="preserve">Sub-Strand 1.2: Chemicals of Life — Teacher Reference (Pre-filled)</w:t>
-      </w:r>
-    </w:p>
-    <w:p>
-      <w:pPr>
-        <w:spacing w:after="80" w:before="120"/>
-      </w:pPr>
-      <w:r>
-        <w:rPr>
-          <w:rFonts w:ascii="Arial" w:cs="Arial" w:eastAsia="Arial" w:hAnsi="Arial"/>
-          <w:b/>
-          <w:bCs/>
-          <w:color w:val="1F3864"/>
-          <w:sz w:val="20"/>
-          <w:szCs w:val="20"/>
-        </w:rPr>
-        <w:t xml:space="preserve">ATTRIBUTION AND LICENSING</w:t>
-      </w:r>
-    </w:p>
-    <w:p>
-      <w:pPr>
-        <w:spacing w:after="60" w:before="0"/>
-      </w:pPr>
-      <w:r>
-        <w:rPr>
-          <w:rFonts w:ascii="Arial" w:cs="Arial" w:eastAsia="Arial" w:hAnsi="Arial"/>
-          <w:b/>
-          <w:bCs/>
-          <w:sz w:val="17"/>
-          <w:szCs w:val="17"/>
-        </w:rPr>
-        <w:t xml:space="preserve">Curriculum Alignment: </w:t>
-      </w:r>
-      <w:r>
-        <w:rPr>
-          <w:rFonts w:ascii="Arial" w:cs="Arial" w:eastAsia="Arial" w:hAnsi="Arial"/>
-          <w:sz w:val="17"/>
-          <w:szCs w:val="17"/>
-        </w:rPr>
-        <w:t xml:space="preserve">Structured in pedagogical alignment with the competence-based curriculum format and learning outcomes established by the Kenya Institute of Curriculum Development (KICD). This material is independently developed and is not officially endorsed or published by KICD.</w:t>
-      </w:r>
-    </w:p>
-    <w:p>
-      <w:pPr>
-        <w:spacing w:after="60" w:before="0"/>
-      </w:pPr>
-      <w:r>
-        <w:rPr>
-          <w:rFonts w:ascii="Arial" w:cs="Arial" w:eastAsia="Arial" w:hAnsi="Arial"/>
-          <w:b/>
-          <w:bCs/>
-          <w:sz w:val="17"/>
-          <w:szCs w:val="17"/>
-        </w:rPr>
-        <w:t xml:space="preserve">Content &amp; Pedagogy: </w:t>
-      </w:r>
-      <w:r>
-        <w:rPr>
-          <w:rFonts w:ascii="Arial" w:cs="Arial" w:eastAsia="Arial" w:hAnsi="Arial"/>
-          <w:sz w:val="17"/>
-          <w:szCs w:val="17"/>
-        </w:rPr>
-        <w:t xml:space="preserve">Developed and adapted by the educator team at SeaVuria (registered 501(c)(3) in the United States and registered NGO in Kenya, No. 872-850A-BF11), who designed the pedagogical framework, lesson templates and exemplar lessons on which this material is based.</w:t>
-      </w:r>
-    </w:p>
-    <w:p>
-      <w:pPr>
-        <w:spacing w:after="60" w:before="0"/>
-      </w:pPr>
-      <w:r>
-        <w:rPr>
-          <w:rFonts w:ascii="Arial" w:cs="Arial" w:eastAsia="Arial" w:hAnsi="Arial"/>
-          <w:b/>
-          <w:bCs/>
-          <w:sz w:val="17"/>
-          <w:szCs w:val="17"/>
-        </w:rPr>
-        <w:t xml:space="preserve">Production &amp; Layout: </w:t>
-      </w:r>
-      <w:r>
-        <w:rPr>
-          <w:rFonts w:ascii="Arial" w:cs="Arial" w:eastAsia="Arial" w:hAnsi="Arial"/>
-          <w:sz w:val="17"/>
-          <w:szCs w:val="17"/>
-        </w:rPr>
-        <w:t xml:space="preserve">Educational design and curriculum sequencing by SeaVuria. Technical layout, structural formatting, and digital optimization/implementation executed in partnership with ARES Education (registered 501(c)(3) in the United States and Canada (as Afretech Aid) and registered NGO in Kenya), with lesson drafting and compilation assisted by AI (Claude, Anthropic).</w:t>
-      </w:r>
-    </w:p>
-    <w:p>
-      <w:pPr>
-        <w:pBdr>
-          <w:bottom w:val="single" w:color="1F3864" w:sz="6" w:space="6"/>
-        </w:pBdr>
-        <w:spacing w:after="60" w:before="0"/>
-      </w:pPr>
-      <w:r>
-        <w:rPr>
-          <w:rFonts w:ascii="Arial" w:cs="Arial" w:eastAsia="Arial" w:hAnsi="Arial"/>
-          <w:b/>
-          <w:bCs/>
-          <w:sz w:val="17"/>
-          <w:szCs w:val="17"/>
-        </w:rPr>
-        <w:t xml:space="preserve">Licensing &amp; Copyright: </w:t>
-      </w:r>
-      <w:r>
-        <w:rPr>
-          <w:rFonts w:ascii="Arial" w:cs="Arial" w:eastAsia="Arial" w:hAnsi="Arial"/>
-          <w:sz w:val="17"/>
-          <w:szCs w:val="17"/>
-        </w:rPr>
-        <w:t xml:space="preserve">© 2026 SeaVuria and ARES. This work is licensed under a </w:t>
-      </w:r>
-      <w:hyperlink w:history="1" r:id="rId_2mxvvpfbojrvji4kr4of">
-        <w:r>
-          <w:rPr>
-            <w:rFonts w:ascii="Arial" w:cs="Arial" w:eastAsia="Arial" w:hAnsi="Arial"/>
-            <w:color w:val="1F6B75"/>
-            <w:sz w:val="17"/>
-            <w:szCs w:val="17"/>
-            <w:u w:val="single" w:color="1F6B75"/>
-          </w:rPr>
-          <w:t xml:space="preserve">Creative Commons Attribution-NonCommercial 4.0 International License</w:t>
-        </w:r>
-      </w:hyperlink>
-      <w:r>
-        <w:rPr>
-          <w:rFonts w:ascii="Arial" w:cs="Arial" w:eastAsia="Arial" w:hAnsi="Arial"/>
-          <w:sz w:val="17"/>
-          <w:szCs w:val="17"/>
-        </w:rPr>
-        <w:t xml:space="preserve"> (</w:t>
-      </w:r>
-      <w:hyperlink w:history="1" r:id="rIdhy_u9edngsooo1fnyk2z9">
-        <w:r>
-          <w:rPr>
-            <w:rFonts w:ascii="Arial" w:cs="Arial" w:eastAsia="Arial" w:hAnsi="Arial"/>
-            <w:color w:val="1F6B75"/>
-            <w:sz w:val="17"/>
-            <w:szCs w:val="17"/>
-            <w:u w:val="single" w:color="1F6B75"/>
-          </w:rPr>
-          <w:t xml:space="preserve">CC BY-NC 4.0</w:t>
-        </w:r>
-      </w:hyperlink>
-      <w:r>
-        <w:rPr>
-          <w:rFonts w:ascii="Arial" w:cs="Arial" w:eastAsia="Arial" w:hAnsi="Arial"/>
-          <w:sz w:val="17"/>
-          <w:szCs w:val="17"/>
-        </w:rPr>
-        <w:t xml:space="preserve">). To view a copy of this license, visit </w:t>
-      </w:r>
-      <w:hyperlink w:history="1" r:id="rIdhr4rnvgigg3zvdcirnxav">
-        <w:r>
-          <w:rPr>
-            <w:rFonts w:ascii="Arial" w:cs="Arial" w:eastAsia="Arial" w:hAnsi="Arial"/>
-            <w:color w:val="1F6B75"/>
-            <w:sz w:val="17"/>
-            <w:szCs w:val="17"/>
-            <w:u w:val="single" w:color="1F6B75"/>
-          </w:rPr>
-          <w:t xml:space="preserve">https://creativecommons.org/licenses/by-nc/4.0/</w:t>
-        </w:r>
-      </w:hyperlink>
-      <w:r>
-        <w:rPr>
-          <w:rFonts w:ascii="Arial" w:cs="Arial" w:eastAsia="Arial" w:hAnsi="Arial"/>
-          <w:sz w:val="17"/>
-          <w:szCs w:val="17"/>
-        </w:rPr>
-        <w:t xml:space="preserve">. You are free to copy, redistribute, and adapt this material in any medium or format, provided appropriate credit is given and the material is not used for commercial purposes. KICD learning outcomes and curriculum designations reproduced here for alignment purposes remain the property of KICD and are not covered by this license. Linked external resources (e.g. CK-12, Khan Academy, PhET) are subject to their own licenses.</w:t>
       </w:r>
     </w:p>
     <w:p>
@@ -1550,6 +1379,185 @@
         </w:tc>
       </w:tr>
     </w:tbl>
+    <w:p>
+      <w:pPr>
+        <w:spacing w:after="120"/>
+      </w:pPr>
+      <w:r>
+        <w:t xml:space="preserve"/>
+      </w:r>
+    </w:p>
+    <w:p>
+      <w:pPr>
+        <w:spacing w:after="80" w:before="120"/>
+      </w:pPr>
+      <w:r>
+        <w:rPr>
+          <w:rFonts w:ascii="Arial" w:cs="Arial" w:eastAsia="Arial" w:hAnsi="Arial"/>
+          <w:b/>
+          <w:bCs/>
+          <w:color w:val="1F3864"/>
+          <w:sz w:val="20"/>
+          <w:szCs w:val="20"/>
+        </w:rPr>
+        <w:t xml:space="preserve">ATTRIBUTION AND LICENSING</w:t>
+      </w:r>
+    </w:p>
+    <w:p>
+      <w:pPr>
+        <w:spacing w:after="60" w:before="0"/>
+      </w:pPr>
+      <w:r>
+        <w:rPr>
+          <w:rFonts w:ascii="Arial" w:cs="Arial" w:eastAsia="Arial" w:hAnsi="Arial"/>
+          <w:b/>
+          <w:bCs/>
+          <w:sz w:val="17"/>
+          <w:szCs w:val="17"/>
+        </w:rPr>
+        <w:t xml:space="preserve">Curriculum Alignment: </w:t>
+      </w:r>
+      <w:r>
+        <w:rPr>
+          <w:rFonts w:ascii="Arial" w:cs="Arial" w:eastAsia="Arial" w:hAnsi="Arial"/>
+          <w:sz w:val="17"/>
+          <w:szCs w:val="17"/>
+        </w:rPr>
+        <w:t xml:space="preserve">Structured in pedagogical alignment with the competence-based curriculum format and learning outcomes established by the Kenya Institute of Curriculum Development (KICD). This material is independently developed and is not officially endorsed or published by KICD.</w:t>
+      </w:r>
+    </w:p>
+    <w:p>
+      <w:pPr>
+        <w:spacing w:after="60" w:before="0"/>
+      </w:pPr>
+      <w:r>
+        <w:rPr>
+          <w:rFonts w:ascii="Arial" w:cs="Arial" w:eastAsia="Arial" w:hAnsi="Arial"/>
+          <w:b/>
+          <w:bCs/>
+          <w:sz w:val="17"/>
+          <w:szCs w:val="17"/>
+        </w:rPr>
+        <w:t xml:space="preserve">Content &amp; Pedagogy: </w:t>
+      </w:r>
+      <w:r>
+        <w:rPr>
+          <w:rFonts w:ascii="Arial" w:cs="Arial" w:eastAsia="Arial" w:hAnsi="Arial"/>
+          <w:sz w:val="17"/>
+          <w:szCs w:val="17"/>
+        </w:rPr>
+        <w:t xml:space="preserve">Developed and adapted by the educator team at SeaVuria (registered 501(c)(3) in the United States and registered NGO in Kenya, No. 872-850A-BF11), who designed the pedagogical framework, lesson templates and exemplar lessons on which this material is based.</w:t>
+      </w:r>
+    </w:p>
+    <w:p>
+      <w:pPr>
+        <w:spacing w:after="60" w:before="0"/>
+      </w:pPr>
+      <w:r>
+        <w:rPr>
+          <w:rFonts w:ascii="Arial" w:cs="Arial" w:eastAsia="Arial" w:hAnsi="Arial"/>
+          <w:b/>
+          <w:bCs/>
+          <w:sz w:val="17"/>
+          <w:szCs w:val="17"/>
+        </w:rPr>
+        <w:t xml:space="preserve">Production &amp; Layout: </w:t>
+      </w:r>
+      <w:r>
+        <w:rPr>
+          <w:rFonts w:ascii="Arial" w:cs="Arial" w:eastAsia="Arial" w:hAnsi="Arial"/>
+          <w:sz w:val="17"/>
+          <w:szCs w:val="17"/>
+        </w:rPr>
+        <w:t xml:space="preserve">Educational design and curriculum sequencing by SeaVuria. Technical layout, structural formatting, and digital optimization/implementation executed in partnership with ARES Education (registered 501(c)(3) in the United States and Canada (as Afretech Aid) and registered NGO in Kenya), with lesson drafting and compilation assisted by AI (Claude, Anthropic).</w:t>
+      </w:r>
+    </w:p>
+    <w:p>
+      <w:pPr>
+        <w:pBdr>
+          <w:bottom w:val="single" w:color="1F3864" w:sz="6" w:space="6"/>
+        </w:pBdr>
+        <w:spacing w:after="60" w:before="0"/>
+      </w:pPr>
+      <w:r>
+        <w:rPr>
+          <w:rFonts w:ascii="Arial" w:cs="Arial" w:eastAsia="Arial" w:hAnsi="Arial"/>
+          <w:b/>
+          <w:bCs/>
+          <w:sz w:val="17"/>
+          <w:szCs w:val="17"/>
+        </w:rPr>
+        <w:t xml:space="preserve">Licensing &amp; Copyright: </w:t>
+      </w:r>
+      <w:r>
+        <w:rPr>
+          <w:rFonts w:ascii="Arial" w:cs="Arial" w:eastAsia="Arial" w:hAnsi="Arial"/>
+          <w:sz w:val="17"/>
+          <w:szCs w:val="17"/>
+        </w:rPr>
+        <w:t xml:space="preserve">© 2026 SeaVuria and ARES. This work is licensed under a </w:t>
+      </w:r>
+      <w:hyperlink w:history="1" r:id="rId5e4oz2_htrii8vxliqvdd">
+        <w:r>
+          <w:rPr>
+            <w:rFonts w:ascii="Arial" w:cs="Arial" w:eastAsia="Arial" w:hAnsi="Arial"/>
+            <w:color w:val="1F6B75"/>
+            <w:sz w:val="17"/>
+            <w:szCs w:val="17"/>
+            <w:u w:val="single" w:color="1F6B75"/>
+          </w:rPr>
+          <w:t xml:space="preserve">Creative Commons Attribution-NonCommercial 4.0 International License</w:t>
+        </w:r>
+      </w:hyperlink>
+      <w:r>
+        <w:rPr>
+          <w:rFonts w:ascii="Arial" w:cs="Arial" w:eastAsia="Arial" w:hAnsi="Arial"/>
+          <w:sz w:val="17"/>
+          <w:szCs w:val="17"/>
+        </w:rPr>
+        <w:t xml:space="preserve"> (</w:t>
+      </w:r>
+      <w:hyperlink w:history="1" r:id="rIdbatue9fu0qqppo7qiy4vv">
+        <w:r>
+          <w:rPr>
+            <w:rFonts w:ascii="Arial" w:cs="Arial" w:eastAsia="Arial" w:hAnsi="Arial"/>
+            <w:color w:val="1F6B75"/>
+            <w:sz w:val="17"/>
+            <w:szCs w:val="17"/>
+            <w:u w:val="single" w:color="1F6B75"/>
+          </w:rPr>
+          <w:t xml:space="preserve">CC BY-NC 4.0</w:t>
+        </w:r>
+      </w:hyperlink>
+      <w:r>
+        <w:rPr>
+          <w:rFonts w:ascii="Arial" w:cs="Arial" w:eastAsia="Arial" w:hAnsi="Arial"/>
+          <w:sz w:val="17"/>
+          <w:szCs w:val="17"/>
+        </w:rPr>
+        <w:t xml:space="preserve">). To view a copy of this license, visit </w:t>
+      </w:r>
+      <w:hyperlink w:history="1" r:id="rId9p_ddov5h-mzbc-sdd61w">
+        <w:r>
+          <w:rPr>
+            <w:rFonts w:ascii="Arial" w:cs="Arial" w:eastAsia="Arial" w:hAnsi="Arial"/>
+            <w:color w:val="1F6B75"/>
+            <w:sz w:val="17"/>
+            <w:szCs w:val="17"/>
+            <w:u w:val="single" w:color="1F6B75"/>
+          </w:rPr>
+          <w:t xml:space="preserve">https://creativecommons.org/licenses/by-nc/4.0/</w:t>
+        </w:r>
+      </w:hyperlink>
+      <w:r>
+        <w:rPr>
+          <w:rFonts w:ascii="Arial" w:cs="Arial" w:eastAsia="Arial" w:hAnsi="Arial"/>
+          <w:sz w:val="17"/>
+          <w:szCs w:val="17"/>
+        </w:rPr>
+        <w:t xml:space="preserve">. You are free to copy, redistribute, and adapt this material in any medium or format, provided appropriate credit is given and the material is not used for commercial purposes. KICD learning outcomes and curriculum designations reproduced here for alignment purposes remain the property of KICD and are not covered by this license. Linked external resources (e.g. CK-12, Khan Academy, PhET) are subject to their own licenses.</w:t>
+      </w:r>
+    </w:p>
     <w:sectPr>
       <w:pgSz w:w="15840" w:h="12240" w:orient="landscape"/>
       <w:pgMar w:top="1080" w:right="1080" w:bottom="1080" w:left="1080" w:header="708" w:footer="708" w:gutter="0"/>

</xml_diff>